<commit_message>
Lay out the Deliverable 2 report without large blank gaps
- Each table and figure is placed at the first paragraph break after its
  mention where it fits on the page, within its own section, instead of
  jumping to the next page and leaving the rest blank; placement checked
  page by page in Word
- Long paragraphs split at natural breaks, so figures can sit beside the
  paragraph that discusses them
- Screenshots trimmed to the key lines and printed output
- Tables kept on one page; References and appendices start a new page
  without a blank page before them
- The permutation-importance chart moves to Appendix B (Figure B1); the
  text still gives its two key numbers

18 pages instead of 22; the largest blank space at the foot of a body page
is now about five lines, down from three-quarters of a page.
</commit_message>
<xml_diff>
--- a/Diabetes_Readmission_Deliverable2_Chinthaluri_Abburi.docx
+++ b/Diabetes_Readmission_Deliverable2_Chinthaluri_Abburi.docx
@@ -293,7 +293,7 @@
           <w:color w:val="000000"/>
           <w:sz w:val="22"/>
         </w:rPr>
-        <w:t>Deliverable 1 tuned one setting per model; this round widened the search and added a third model family (Table 1). The logistic regression now crosses seven penalty strengths with L1 and L2 penalties; the random forest (Breiman, 2001) varies tree depth, leaf size, and the share of features tried at each split; and gradient boosting (Friedman, 2001), which fits each tree to the errors of the trees before it, joins as a challenger. Figure 1 shows the search: every setting is scored by ROC-AUC on the same three patient-grouped folds, and the test set is not touched. We fixed one rule in advance: a challenger replaces the logistic regression only if it gains at least .005 in cross-validated AUC, since a smaller gain does not justify giving up readable coefficients (Rudin, 2019). The forest won (.665 against .663 for boosting and .657 for the logistic regression), led in all three folds, and even its worst setting beat the best logistic regression. Its best setting grows trees to full depth but requires 50 encounters in every leaf, which keeps it from memorizing individual patients.</w:t>
+        <w:t>Deliverable 1 tuned one setting per model; this round widened the search and added a third model family (Table 1). The logistic regression now crosses seven penalty strengths with L1 and L2 penalties; the random forest (Breiman, 2001) varies tree depth, leaf size, and the share of features tried at each split; and gradient boosting (Friedman, 2001), which fits each tree to the errors of the trees before it, joins as a challenger. Figure 1 shows the search: every setting is scored by ROC-AUC on the same three patient-grouped folds, and the test set is not touched.</w:t>
       </w:r>
     </w:p>
     <w:p>
@@ -373,6 +373,7 @@
           </w:tcPr>
           <w:p>
             <w:pPr>
+              <w:keepNext/>
               <w:spacing w:line="240" w:lineRule="auto" w:after="0"/>
               <w:jc w:val="left"/>
             </w:pPr>
@@ -405,6 +406,7 @@
           </w:tcPr>
           <w:p>
             <w:pPr>
+              <w:keepNext/>
               <w:spacing w:line="240" w:lineRule="auto" w:after="0"/>
               <w:jc w:val="left"/>
             </w:pPr>
@@ -437,6 +439,7 @@
           </w:tcPr>
           <w:p>
             <w:pPr>
+              <w:keepNext/>
               <w:spacing w:line="240" w:lineRule="auto" w:after="0"/>
               <w:jc w:val="left"/>
             </w:pPr>
@@ -469,6 +472,7 @@
           </w:tcPr>
           <w:p>
             <w:pPr>
+              <w:keepNext/>
               <w:spacing w:line="240" w:lineRule="auto" w:after="0"/>
               <w:jc w:val="left"/>
             </w:pPr>
@@ -501,6 +505,7 @@
           </w:tcPr>
           <w:p>
             <w:pPr>
+              <w:keepNext/>
               <w:spacing w:line="240" w:lineRule="auto" w:after="0"/>
               <w:jc w:val="left"/>
             </w:pPr>
@@ -573,6 +578,7 @@
           </w:tcPr>
           <w:p>
             <w:pPr>
+              <w:keepNext/>
               <w:spacing w:line="240" w:lineRule="auto" w:after="0"/>
               <w:jc w:val="left"/>
             </w:pPr>
@@ -645,6 +651,7 @@
           </w:tcPr>
           <w:p>
             <w:pPr>
+              <w:keepNext/>
               <w:spacing w:line="240" w:lineRule="auto" w:after="0"/>
               <w:jc w:val="left"/>
             </w:pPr>
@@ -679,6 +686,7 @@
           </w:tcPr>
           <w:p>
             <w:pPr>
+              <w:keepNext/>
               <w:spacing w:line="240" w:lineRule="auto" w:after="0"/>
               <w:jc w:val="left"/>
             </w:pPr>
@@ -708,6 +716,7 @@
           </w:tcPr>
           <w:p>
             <w:pPr>
+              <w:keepNext/>
               <w:spacing w:line="240" w:lineRule="auto" w:after="0"/>
               <w:jc w:val="left"/>
             </w:pPr>
@@ -737,6 +746,7 @@
           </w:tcPr>
           <w:p>
             <w:pPr>
+              <w:keepNext/>
               <w:spacing w:line="240" w:lineRule="auto" w:after="0"/>
               <w:jc w:val="left"/>
             </w:pPr>
@@ -766,6 +776,7 @@
           </w:tcPr>
           <w:p>
             <w:pPr>
+              <w:keepNext/>
               <w:spacing w:line="240" w:lineRule="auto" w:after="0"/>
               <w:jc w:val="left"/>
             </w:pPr>
@@ -795,6 +806,7 @@
           </w:tcPr>
           <w:p>
             <w:pPr>
+              <w:keepNext/>
               <w:spacing w:line="240" w:lineRule="auto" w:after="0"/>
               <w:jc w:val="left"/>
             </w:pPr>
@@ -824,6 +836,7 @@
           </w:tcPr>
           <w:p>
             <w:pPr>
+              <w:keepNext/>
               <w:spacing w:line="240" w:lineRule="auto" w:after="0"/>
               <w:jc w:val="left"/>
             </w:pPr>
@@ -853,6 +866,7 @@
           </w:tcPr>
           <w:p>
             <w:pPr>
+              <w:keepNext/>
               <w:spacing w:line="240" w:lineRule="auto" w:after="0"/>
               <w:jc w:val="left"/>
             </w:pPr>
@@ -887,6 +901,7 @@
           </w:tcPr>
           <w:p>
             <w:pPr>
+              <w:keepNext/>
               <w:spacing w:line="240" w:lineRule="auto" w:after="0"/>
               <w:jc w:val="left"/>
             </w:pPr>
@@ -916,6 +931,7 @@
           </w:tcPr>
           <w:p>
             <w:pPr>
+              <w:keepNext/>
               <w:spacing w:line="240" w:lineRule="auto" w:after="0"/>
               <w:jc w:val="left"/>
             </w:pPr>
@@ -945,6 +961,7 @@
           </w:tcPr>
           <w:p>
             <w:pPr>
+              <w:keepNext/>
               <w:spacing w:line="240" w:lineRule="auto" w:after="0"/>
               <w:jc w:val="left"/>
             </w:pPr>
@@ -974,6 +991,7 @@
           </w:tcPr>
           <w:p>
             <w:pPr>
+              <w:keepNext/>
               <w:spacing w:line="240" w:lineRule="auto" w:after="0"/>
               <w:jc w:val="left"/>
             </w:pPr>
@@ -1003,6 +1021,7 @@
           </w:tcPr>
           <w:p>
             <w:pPr>
+              <w:keepNext/>
               <w:spacing w:line="240" w:lineRule="auto" w:after="0"/>
               <w:jc w:val="left"/>
             </w:pPr>
@@ -1032,6 +1051,7 @@
           </w:tcPr>
           <w:p>
             <w:pPr>
+              <w:keepNext/>
               <w:spacing w:line="240" w:lineRule="auto" w:after="0"/>
               <w:jc w:val="left"/>
             </w:pPr>
@@ -1061,6 +1081,7 @@
           </w:tcPr>
           <w:p>
             <w:pPr>
+              <w:keepNext/>
               <w:spacing w:line="240" w:lineRule="auto" w:after="0"/>
               <w:jc w:val="left"/>
             </w:pPr>
@@ -1095,6 +1116,7 @@
           </w:tcPr>
           <w:p>
             <w:pPr>
+              <w:keepNext/>
               <w:spacing w:line="240" w:lineRule="auto" w:after="0"/>
               <w:jc w:val="left"/>
             </w:pPr>
@@ -1124,6 +1146,7 @@
           </w:tcPr>
           <w:p>
             <w:pPr>
+              <w:keepNext/>
               <w:spacing w:line="240" w:lineRule="auto" w:after="0"/>
               <w:jc w:val="left"/>
             </w:pPr>
@@ -1153,6 +1176,7 @@
           </w:tcPr>
           <w:p>
             <w:pPr>
+              <w:keepNext/>
               <w:spacing w:line="240" w:lineRule="auto" w:after="0"/>
               <w:jc w:val="left"/>
             </w:pPr>
@@ -1182,6 +1206,7 @@
           </w:tcPr>
           <w:p>
             <w:pPr>
+              <w:keepNext/>
               <w:spacing w:line="240" w:lineRule="auto" w:after="0"/>
               <w:jc w:val="left"/>
             </w:pPr>
@@ -1211,6 +1236,7 @@
           </w:tcPr>
           <w:p>
             <w:pPr>
+              <w:keepNext/>
               <w:spacing w:line="240" w:lineRule="auto" w:after="0"/>
               <w:jc w:val="left"/>
             </w:pPr>
@@ -1240,6 +1266,7 @@
           </w:tcPr>
           <w:p>
             <w:pPr>
+              <w:keepNext/>
               <w:spacing w:line="240" w:lineRule="auto" w:after="0"/>
               <w:jc w:val="left"/>
             </w:pPr>
@@ -1269,6 +1296,7 @@
           </w:tcPr>
           <w:p>
             <w:pPr>
+              <w:keepNext/>
               <w:spacing w:line="240" w:lineRule="auto" w:after="0"/>
               <w:jc w:val="left"/>
             </w:pPr>
@@ -1357,7 +1385,7 @@
       <w:r>
         <w:drawing>
           <wp:inline xmlns:a="http://schemas.openxmlformats.org/drawingml/2006/main" xmlns:pic="http://schemas.openxmlformats.org/drawingml/2006/picture">
-            <wp:extent cx="5760720" cy="5564947"/>
+            <wp:extent cx="5486400" cy="3701237"/>
             <wp:docPr id="1" name="Picture 1"/>
             <wp:cNvGraphicFramePr>
               <a:graphicFrameLocks noChangeAspect="1"/>
@@ -1378,7 +1406,7 @@
                   <pic:spPr>
                     <a:xfrm>
                       <a:off x="0" y="0"/>
-                      <a:ext cx="5760720" cy="5564947"/>
+                      <a:ext cx="5486400" cy="3701237"/>
                     </a:xfrm>
                     <a:prstGeom prst="rect"/>
                   </pic:spPr>
@@ -1412,7 +1440,24 @@
           <w:color w:val="000000"/>
           <w:sz w:val="20"/>
         </w:rPr>
-        <w:t>Cell [24] of the notebook (Appendix A), Section 15. Excerpt; gray bars mark omitted lines (imports, the boosting pipeline, and bookkeeping). The printed table gives each model's best setting under cross-validation, as in Table 1.</w:t>
+        <w:t>Cell [24] of the notebook (Appendix A), Section 15. Excerpt; gray bars mark omitted lines (imports, the boosting pipeline, bookkeeping, and printing). The printed table gives each model's best setting under cross-validation, as in Table 1.</w:t>
+      </w:r>
+    </w:p>
+    <w:p>
+      <w:pPr>
+        <w:spacing w:line="480" w:lineRule="auto" w:after="0"/>
+        <w:ind w:firstLine="720"/>
+        <w:jc w:val="both"/>
+      </w:pPr>
+      <w:r>
+        <w:rPr>
+          <w:rFonts w:ascii="Georgia" w:hAnsi="Georgia"/>
+          <w:b w:val="0"/>
+          <w:i w:val="0"/>
+          <w:color w:val="000000"/>
+          <w:sz w:val="22"/>
+        </w:rPr>
+        <w:t>We fixed one rule in advance: a challenger replaces the logistic regression only if it gains at least .005 in cross-validated AUC, since a smaller gain does not justify giving up readable coefficients (Rudin, 2019). The forest won (.665 against .663 for boosting and .657 for the logistic regression), led in all three folds, and even its worst setting beat the best logistic regression. Its best setting grows trees to full depth but requires 50 encounters in every leaf, which keeps it from memorizing individual patients.</w:t>
       </w:r>
     </w:p>
     <w:p>
@@ -1446,7 +1491,7 @@
           <w:color w:val="000000"/>
           <w:sz w:val="22"/>
         </w:rPr>
-        <w:t>Before the final test, two steps turned the forest's scores into a decision (Figure 2). First, scikit-learn's calibration wrapper (Pedregosa et al., 2011) learned a map from score to probability on patient-grouped folds, and the sigmoid and isotonic maps (Niculescu-Mizil &amp; Caruana, 2005) were compared by out-of-fold Brier score, the mean squared error of a probability (Brier, 1950). Isotonic was marginally best (.0972). Figure 3 shows why calibration mattered so much for the initial model (.229) and so little for the forest, which, trained without class weights, already followed the diagonal. Second, the flag thresholds are the scores above which the top 5%, 10%, and 20% of out-of-fold training predictions fall (.224, .190, and .160), so the test set played no part in setting them (Kaufman et al., 2012).</w:t>
+        <w:t>Before the final test, two steps turned the forest's scores into a decision (Figure 2). First, scikit-learn's calibration wrapper (Pedregosa et al., 2011) learned a map from score to probability on patient-grouped folds, and the sigmoid and isotonic maps (Niculescu-Mizil &amp; Caruana, 2005) were compared by out-of-fold Brier score, the mean squared error of a probability (Brier, 1950). Isotonic was marginally best (.0972). Figure 3 shows why calibration mattered so much for the initial model (.229) and so little for the forest, which, trained without class weights, already followed the diagonal.</w:t>
       </w:r>
     </w:p>
     <w:p>
@@ -1493,7 +1538,7 @@
       <w:r>
         <w:drawing>
           <wp:inline xmlns:a="http://schemas.openxmlformats.org/drawingml/2006/main" xmlns:pic="http://schemas.openxmlformats.org/drawingml/2006/picture">
-            <wp:extent cx="5760720" cy="4809701"/>
+            <wp:extent cx="5486400" cy="4043294"/>
             <wp:docPr id="2" name="Picture 2"/>
             <wp:cNvGraphicFramePr>
               <a:graphicFrameLocks noChangeAspect="1"/>
@@ -1514,7 +1559,7 @@
                   <pic:spPr>
                     <a:xfrm>
                       <a:off x="0" y="0"/>
-                      <a:ext cx="5760720" cy="4809701"/>
+                      <a:ext cx="5486400" cy="4043294"/>
                     </a:xfrm>
                     <a:prstGeom prst="rect"/>
                   </pic:spPr>
@@ -1667,7 +1712,24 @@
           <w:color w:val="000000"/>
           <w:sz w:val="22"/>
         </w:rPr>
-        <w:t>Table 2 and Figure 4 compare the two models on the held-out patients, used once. The final model is better on every measure, and each 95% patient-bootstrap interval for the difference excludes zero. The largest change is in the probabilities: the Brier score fell from .229 to .096, and the mean predicted risk from .469 to .114 against an observed .113, so a predicted 20% can be read as about one patient in five (Van Calster et al., 2019). Ranking improved modestly (ROC-AUC .668 vs. .661). At equal capacity the gain is clearer: lift in the top 10% rose from 2.08 to 2.21, ahead of the prior-admissions rule (2.09) that the initial model only tied, although the two still tie at 5% capacity. At the 10% threshold the model reached 23% of readmissions, and one flagged patient in four was readmitted (precision .245). Permutation importance (Figure 5) shows that prior inpatient admissions and discharge destination carry the model (AUC drops of .070 and .053; no other input exceeds .005), so the forest gains by combining known signals more flexibly, not by finding new ones. The result is a well-calibrated, modestly sharper model, not a breakthrough: at 10% capacity it still misses about three readmissions in four.</w:t>
+        <w:t>Second, the flag thresholds are the scores above which the top 5%, 10%, and 20% of out-of-fold training predictions fall (.224, .190, and .160), so the test set played no part in setting them (Kaufman et al., 2012).</w:t>
+      </w:r>
+    </w:p>
+    <w:p>
+      <w:pPr>
+        <w:spacing w:line="480" w:lineRule="auto" w:after="0"/>
+        <w:ind w:firstLine="720"/>
+        <w:jc w:val="both"/>
+      </w:pPr>
+      <w:r>
+        <w:rPr>
+          <w:rFonts w:ascii="Georgia" w:hAnsi="Georgia"/>
+          <w:b w:val="0"/>
+          <w:i w:val="0"/>
+          <w:color w:val="000000"/>
+          <w:sz w:val="22"/>
+        </w:rPr>
+        <w:t>Table 2 and Figure 4 compare the two models on the held-out patients, used once. The final model is better on every measure, and each 95% patient-bootstrap interval for the difference excludes zero. The largest change is in the probabilities: the Brier score fell from .229 to .096, and the mean predicted risk from .469 to .114 against an observed .113, so a predicted 20% can be read as about one patient in five (Van Calster et al., 2019).</w:t>
       </w:r>
     </w:p>
     <w:p>
@@ -1744,6 +1806,7 @@
           </w:tcPr>
           <w:p>
             <w:pPr>
+              <w:keepNext/>
               <w:spacing w:line="240" w:lineRule="auto" w:after="0"/>
               <w:jc w:val="left"/>
             </w:pPr>
@@ -1776,6 +1839,7 @@
           </w:tcPr>
           <w:p>
             <w:pPr>
+              <w:keepNext/>
               <w:spacing w:line="240" w:lineRule="auto" w:after="0"/>
               <w:jc w:val="left"/>
             </w:pPr>
@@ -1808,6 +1872,7 @@
           </w:tcPr>
           <w:p>
             <w:pPr>
+              <w:keepNext/>
               <w:spacing w:line="240" w:lineRule="auto" w:after="0"/>
               <w:jc w:val="left"/>
             </w:pPr>
@@ -1840,6 +1905,7 @@
           </w:tcPr>
           <w:p>
             <w:pPr>
+              <w:keepNext/>
               <w:spacing w:line="240" w:lineRule="auto" w:after="0"/>
               <w:jc w:val="left"/>
             </w:pPr>
@@ -1874,6 +1940,7 @@
           </w:tcPr>
           <w:p>
             <w:pPr>
+              <w:keepNext/>
               <w:spacing w:line="240" w:lineRule="auto" w:after="0"/>
               <w:jc w:val="left"/>
             </w:pPr>
@@ -1903,6 +1970,7 @@
           </w:tcPr>
           <w:p>
             <w:pPr>
+              <w:keepNext/>
               <w:spacing w:line="240" w:lineRule="auto" w:after="0"/>
               <w:jc w:val="left"/>
             </w:pPr>
@@ -1932,6 +2000,7 @@
           </w:tcPr>
           <w:p>
             <w:pPr>
+              <w:keepNext/>
               <w:spacing w:line="240" w:lineRule="auto" w:after="0"/>
               <w:jc w:val="left"/>
             </w:pPr>
@@ -1961,6 +2030,7 @@
           </w:tcPr>
           <w:p>
             <w:pPr>
+              <w:keepNext/>
               <w:spacing w:line="240" w:lineRule="auto" w:after="0"/>
               <w:jc w:val="left"/>
             </w:pPr>
@@ -1995,6 +2065,7 @@
           </w:tcPr>
           <w:p>
             <w:pPr>
+              <w:keepNext/>
               <w:spacing w:line="240" w:lineRule="auto" w:after="0"/>
               <w:jc w:val="left"/>
             </w:pPr>
@@ -2024,6 +2095,7 @@
           </w:tcPr>
           <w:p>
             <w:pPr>
+              <w:keepNext/>
               <w:spacing w:line="240" w:lineRule="auto" w:after="0"/>
               <w:jc w:val="left"/>
             </w:pPr>
@@ -2053,6 +2125,7 @@
           </w:tcPr>
           <w:p>
             <w:pPr>
+              <w:keepNext/>
               <w:spacing w:line="240" w:lineRule="auto" w:after="0"/>
               <w:jc w:val="left"/>
             </w:pPr>
@@ -2082,6 +2155,7 @@
           </w:tcPr>
           <w:p>
             <w:pPr>
+              <w:keepNext/>
               <w:spacing w:line="240" w:lineRule="auto" w:after="0"/>
               <w:jc w:val="left"/>
             </w:pPr>
@@ -2116,6 +2190,7 @@
           </w:tcPr>
           <w:p>
             <w:pPr>
+              <w:keepNext/>
               <w:spacing w:line="240" w:lineRule="auto" w:after="0"/>
               <w:jc w:val="left"/>
             </w:pPr>
@@ -2145,6 +2220,7 @@
           </w:tcPr>
           <w:p>
             <w:pPr>
+              <w:keepNext/>
               <w:spacing w:line="240" w:lineRule="auto" w:after="0"/>
               <w:jc w:val="left"/>
             </w:pPr>
@@ -2174,6 +2250,7 @@
           </w:tcPr>
           <w:p>
             <w:pPr>
+              <w:keepNext/>
               <w:spacing w:line="240" w:lineRule="auto" w:after="0"/>
               <w:jc w:val="left"/>
             </w:pPr>
@@ -2203,6 +2280,7 @@
           </w:tcPr>
           <w:p>
             <w:pPr>
+              <w:keepNext/>
               <w:spacing w:line="240" w:lineRule="auto" w:after="0"/>
               <w:jc w:val="left"/>
             </w:pPr>
@@ -2237,6 +2315,7 @@
           </w:tcPr>
           <w:p>
             <w:pPr>
+              <w:keepNext/>
               <w:spacing w:line="240" w:lineRule="auto" w:after="0"/>
               <w:jc w:val="left"/>
             </w:pPr>
@@ -2266,6 +2345,7 @@
           </w:tcPr>
           <w:p>
             <w:pPr>
+              <w:keepNext/>
               <w:spacing w:line="240" w:lineRule="auto" w:after="0"/>
               <w:jc w:val="left"/>
             </w:pPr>
@@ -2295,6 +2375,7 @@
           </w:tcPr>
           <w:p>
             <w:pPr>
+              <w:keepNext/>
               <w:spacing w:line="240" w:lineRule="auto" w:after="0"/>
               <w:jc w:val="left"/>
             </w:pPr>
@@ -2324,6 +2405,7 @@
           </w:tcPr>
           <w:p>
             <w:pPr>
+              <w:keepNext/>
               <w:spacing w:line="240" w:lineRule="auto" w:after="0"/>
               <w:jc w:val="left"/>
             </w:pPr>
@@ -2358,6 +2440,7 @@
           </w:tcPr>
           <w:p>
             <w:pPr>
+              <w:keepNext/>
               <w:spacing w:line="240" w:lineRule="auto" w:after="0"/>
               <w:jc w:val="left"/>
             </w:pPr>
@@ -2387,6 +2470,7 @@
           </w:tcPr>
           <w:p>
             <w:pPr>
+              <w:keepNext/>
               <w:spacing w:line="240" w:lineRule="auto" w:after="0"/>
               <w:jc w:val="left"/>
             </w:pPr>
@@ -2416,6 +2500,7 @@
           </w:tcPr>
           <w:p>
             <w:pPr>
+              <w:keepNext/>
               <w:spacing w:line="240" w:lineRule="auto" w:after="0"/>
               <w:jc w:val="left"/>
             </w:pPr>
@@ -2445,6 +2530,7 @@
           </w:tcPr>
           <w:p>
             <w:pPr>
+              <w:keepNext/>
               <w:spacing w:line="240" w:lineRule="auto" w:after="0"/>
               <w:jc w:val="left"/>
             </w:pPr>
@@ -2479,6 +2565,7 @@
           </w:tcPr>
           <w:p>
             <w:pPr>
+              <w:keepNext/>
               <w:spacing w:line="240" w:lineRule="auto" w:after="0"/>
               <w:jc w:val="left"/>
             </w:pPr>
@@ -2508,6 +2595,7 @@
           </w:tcPr>
           <w:p>
             <w:pPr>
+              <w:keepNext/>
               <w:spacing w:line="240" w:lineRule="auto" w:after="0"/>
               <w:jc w:val="left"/>
             </w:pPr>
@@ -2537,6 +2625,7 @@
           </w:tcPr>
           <w:p>
             <w:pPr>
+              <w:keepNext/>
               <w:spacing w:line="240" w:lineRule="auto" w:after="0"/>
               <w:jc w:val="left"/>
             </w:pPr>
@@ -2566,6 +2655,7 @@
           </w:tcPr>
           <w:p>
             <w:pPr>
+              <w:keepNext/>
               <w:spacing w:line="240" w:lineRule="auto" w:after="0"/>
               <w:jc w:val="left"/>
             </w:pPr>
@@ -2600,6 +2690,7 @@
           </w:tcPr>
           <w:p>
             <w:pPr>
+              <w:keepNext/>
               <w:spacing w:line="240" w:lineRule="auto" w:after="0"/>
               <w:jc w:val="left"/>
             </w:pPr>
@@ -2629,6 +2720,7 @@
           </w:tcPr>
           <w:p>
             <w:pPr>
+              <w:keepNext/>
               <w:spacing w:line="240" w:lineRule="auto" w:after="0"/>
               <w:jc w:val="left"/>
             </w:pPr>
@@ -2658,6 +2750,7 @@
           </w:tcPr>
           <w:p>
             <w:pPr>
+              <w:keepNext/>
               <w:spacing w:line="240" w:lineRule="auto" w:after="0"/>
               <w:jc w:val="left"/>
             </w:pPr>
@@ -2687,6 +2780,7 @@
           </w:tcPr>
           <w:p>
             <w:pPr>
+              <w:keepNext/>
               <w:spacing w:line="240" w:lineRule="auto" w:after="0"/>
               <w:jc w:val="left"/>
             </w:pPr>
@@ -2721,6 +2815,7 @@
           </w:tcPr>
           <w:p>
             <w:pPr>
+              <w:keepNext/>
               <w:spacing w:line="240" w:lineRule="auto" w:after="0"/>
               <w:jc w:val="left"/>
             </w:pPr>
@@ -2750,6 +2845,7 @@
           </w:tcPr>
           <w:p>
             <w:pPr>
+              <w:keepNext/>
               <w:spacing w:line="240" w:lineRule="auto" w:after="0"/>
               <w:jc w:val="left"/>
             </w:pPr>
@@ -2779,6 +2875,7 @@
           </w:tcPr>
           <w:p>
             <w:pPr>
+              <w:keepNext/>
               <w:spacing w:line="240" w:lineRule="auto" w:after="0"/>
               <w:jc w:val="left"/>
             </w:pPr>
@@ -2808,6 +2905,7 @@
           </w:tcPr>
           <w:p>
             <w:pPr>
+              <w:keepNext/>
               <w:spacing w:line="240" w:lineRule="auto" w:after="0"/>
               <w:jc w:val="left"/>
             </w:pPr>
@@ -2842,6 +2940,7 @@
           </w:tcPr>
           <w:p>
             <w:pPr>
+              <w:keepNext/>
               <w:spacing w:line="240" w:lineRule="auto" w:after="0"/>
               <w:jc w:val="left"/>
             </w:pPr>
@@ -2871,6 +2970,7 @@
           </w:tcPr>
           <w:p>
             <w:pPr>
+              <w:keepNext/>
               <w:spacing w:line="240" w:lineRule="auto" w:after="0"/>
               <w:jc w:val="left"/>
             </w:pPr>
@@ -2900,6 +3000,7 @@
           </w:tcPr>
           <w:p>
             <w:pPr>
+              <w:keepNext/>
               <w:spacing w:line="240" w:lineRule="auto" w:after="0"/>
               <w:jc w:val="left"/>
             </w:pPr>
@@ -2929,6 +3030,7 @@
           </w:tcPr>
           <w:p>
             <w:pPr>
+              <w:keepNext/>
               <w:spacing w:line="240" w:lineRule="auto" w:after="0"/>
               <w:jc w:val="left"/>
             </w:pPr>
@@ -2975,6 +3077,40 @@
     </w:p>
     <w:p>
       <w:pPr>
+        <w:spacing w:line="480" w:lineRule="auto" w:after="0"/>
+        <w:ind w:firstLine="720"/>
+        <w:jc w:val="both"/>
+      </w:pPr>
+      <w:r>
+        <w:rPr>
+          <w:rFonts w:ascii="Georgia" w:hAnsi="Georgia"/>
+          <w:b w:val="0"/>
+          <w:i w:val="0"/>
+          <w:color w:val="000000"/>
+          <w:sz w:val="22"/>
+        </w:rPr>
+        <w:t>Ranking improved modestly (ROC-AUC .668 vs. .661). At equal capacity the gain is clearer: lift in the top 10% rose from 2.08 to 2.21, ahead of the prior-admissions rule (2.09) that the initial model only tied, although the two still tie at 5% capacity. At the 10% threshold the model reached 23% of readmissions, and one flagged patient in four was readmitted (precision .245).</w:t>
+      </w:r>
+    </w:p>
+    <w:p>
+      <w:pPr>
+        <w:spacing w:line="480" w:lineRule="auto" w:after="0"/>
+        <w:ind w:firstLine="720"/>
+        <w:jc w:val="both"/>
+      </w:pPr>
+      <w:r>
+        <w:rPr>
+          <w:rFonts w:ascii="Georgia" w:hAnsi="Georgia"/>
+          <w:b w:val="0"/>
+          <w:i w:val="0"/>
+          <w:color w:val="000000"/>
+          <w:sz w:val="22"/>
+        </w:rPr>
+        <w:t>Permutation importance (Figure B1 in Appendix B) shows that prior inpatient admissions and discharge destination carry the model (AUC drops of .070 and .053; no other input exceeds .005), so the forest gains by combining known signals more flexibly, not by finding new ones. The result is a well-calibrated, modestly sharper model, not a breakthrough: at 10% capacity it still misses about three readmissions in four.</w:t>
+      </w:r>
+    </w:p>
+    <w:p>
+      <w:pPr>
         <w:keepNext/>
         <w:keepLines/>
         <w:spacing w:line="480" w:lineRule="auto" w:after="0" w:before="120"/>
@@ -3017,7 +3153,7 @@
       <w:r>
         <w:drawing>
           <wp:inline xmlns:a="http://schemas.openxmlformats.org/drawingml/2006/main" xmlns:pic="http://schemas.openxmlformats.org/drawingml/2006/picture">
-            <wp:extent cx="5943600" cy="4494406"/>
+            <wp:extent cx="5303520" cy="4010393"/>
             <wp:docPr id="4" name="Picture 4"/>
             <wp:cNvGraphicFramePr>
               <a:graphicFrameLocks noChangeAspect="1"/>
@@ -3038,7 +3174,7 @@
                   <pic:spPr>
                     <a:xfrm>
                       <a:off x="0" y="0"/>
-                      <a:ext cx="5943600" cy="4494406"/>
+                      <a:ext cx="5303520" cy="4010393"/>
                     </a:xfrm>
                     <a:prstGeom prst="rect"/>
                   </pic:spPr>
@@ -3078,108 +3214,6 @@
     <w:p>
       <w:pPr>
         <w:keepNext/>
-        <w:keepLines/>
-        <w:spacing w:line="480" w:lineRule="auto" w:after="0" w:before="120"/>
-      </w:pPr>
-      <w:r>
-        <w:rPr>
-          <w:rFonts w:ascii="Georgia" w:hAnsi="Georgia"/>
-          <w:b/>
-          <w:i w:val="0"/>
-          <w:color w:val="000000"/>
-          <w:sz w:val="22"/>
-        </w:rPr>
-        <w:t>Figure 5</w:t>
-      </w:r>
-    </w:p>
-    <w:p>
-      <w:pPr>
-        <w:keepNext/>
-        <w:keepLines/>
-        <w:spacing w:line="480" w:lineRule="auto" w:after="0"/>
-      </w:pPr>
-      <w:r>
-        <w:rPr>
-          <w:rFonts w:ascii="Georgia" w:hAnsi="Georgia"/>
-          <w:b w:val="0"/>
-          <w:i/>
-          <w:color w:val="000000"/>
-          <w:sz w:val="22"/>
-        </w:rPr>
-        <w:t>Permutation Importance of the Final Model on the Test Set</w:t>
-      </w:r>
-    </w:p>
-    <w:p>
-      <w:pPr>
-        <w:keepNext/>
-        <w:keepLines/>
-        <w:spacing w:line="240" w:lineRule="auto" w:before="80" w:after="40"/>
-        <w:jc w:val="center"/>
-      </w:pPr>
-      <w:r>
-        <w:drawing>
-          <wp:inline xmlns:a="http://schemas.openxmlformats.org/drawingml/2006/main" xmlns:pic="http://schemas.openxmlformats.org/drawingml/2006/picture">
-            <wp:extent cx="4937760" cy="3110758"/>
-            <wp:docPr id="5" name="Picture 5"/>
-            <wp:cNvGraphicFramePr>
-              <a:graphicFrameLocks noChangeAspect="1"/>
-            </wp:cNvGraphicFramePr>
-            <a:graphic>
-              <a:graphicData uri="http://schemas.openxmlformats.org/drawingml/2006/picture">
-                <pic:pic>
-                  <pic:nvPicPr>
-                    <pic:cNvPr id="0" name="d2_importance.png"/>
-                    <pic:cNvPicPr/>
-                  </pic:nvPicPr>
-                  <pic:blipFill>
-                    <a:blip r:embed="rId14"/>
-                    <a:stretch>
-                      <a:fillRect/>
-                    </a:stretch>
-                  </pic:blipFill>
-                  <pic:spPr>
-                    <a:xfrm>
-                      <a:off x="0" y="0"/>
-                      <a:ext cx="4937760" cy="3110758"/>
-                    </a:xfrm>
-                    <a:prstGeom prst="rect"/>
-                  </pic:spPr>
-                </pic:pic>
-              </a:graphicData>
-            </a:graphic>
-          </wp:inline>
-        </w:drawing>
-      </w:r>
-    </w:p>
-    <w:p>
-      <w:pPr>
-        <w:keepLines/>
-        <w:spacing w:line="480" w:lineRule="auto" w:after="0"/>
-      </w:pPr>
-      <w:r>
-        <w:rPr>
-          <w:rFonts w:ascii="Georgia" w:hAnsi="Georgia"/>
-          <w:b w:val="0"/>
-          <w:i/>
-          <w:color w:val="000000"/>
-          <w:sz w:val="20"/>
-        </w:rPr>
-        <w:t xml:space="preserve">Note. </w:t>
-      </w:r>
-      <w:r>
-        <w:rPr>
-          <w:rFonts w:ascii="Georgia" w:hAnsi="Georgia"/>
-          <w:b w:val="0"/>
-          <w:i w:val="0"/>
-          <w:color w:val="000000"/>
-          <w:sz w:val="20"/>
-        </w:rPr>
-        <w:t>Drop in test ROC-AUC when one input column is shuffled (mean of five repeats; bars show one standard deviation). Each bar covers all dummy columns of a categorical input.</w:t>
-      </w:r>
-    </w:p>
-    <w:p>
-      <w:pPr>
-        <w:keepNext/>
         <w:spacing w:line="480" w:lineRule="auto" w:before="0" w:after="0"/>
         <w:jc w:val="center"/>
       </w:pPr>
@@ -3208,7 +3242,7 @@
           <w:color w:val="000000"/>
           <w:sz w:val="22"/>
         </w:rPr>
-        <w:t>Figure 6 audits the final model at the 10% threshold by race, gender, age, and payer, none of which is a model input. Calibration held within groups: in every group of at least 1,000 test encounters, mean predicted risk was within 0.7 percentage points of the observed rate. Ranking did not. Patients 65 and older were ranked less well (AUC .641 vs. .715) and, though flagged as often, had fewer of their readmissions reached (recall .206 vs. .298; gap 95% CI [.042, .152]), while race and gender gaps were smaller, with overlapping intervals. Separate age thresholds set on training data to equalize recall, the equal-opportunity standard (Hardt et al., 2016), closed most of the gap (Figure 7), but mainly by reaching fewer younger patients, and overall recall fell by .011, so we would not adopt them by default. Other limits remain: prior admissions, the main input, reflects access to care as well as need (Obermeyer et al., 2019); data from 1999–2008 must be recalibrated before use; a deployed model would handle identifiable records, so access must be limited to the care team under HIPAA; and a confident score invites over-reliance (Goddard et al., 2012), which the safeguards below address.</w:t>
+        <w:t>Figure 5 audits the final model at the 10% threshold by race, gender, age, and payer, none of which is a model input. Calibration held within groups: in every group of at least 1,000 test encounters, mean predicted risk was within 0.7 percentage points of the observed rate. Ranking did not. Patients 65 and older were ranked less well (AUC .641 vs. .715) and, though flagged as often, had fewer of their readmissions reached (recall .206 vs. .298; gap 95% CI [.042, .152]), while race and gender gaps were smaller, with overlapping intervals.</w:t>
       </w:r>
     </w:p>
     <w:p>
@@ -3225,7 +3259,7 @@
           <w:color w:val="000000"/>
           <w:sz w:val="22"/>
         </w:rPr>
-        <w:t>Figure 6</w:t>
+        <w:t>Figure 5</w:t>
       </w:r>
     </w:p>
     <w:p>
@@ -3256,7 +3290,7 @@
         <w:drawing>
           <wp:inline xmlns:a="http://schemas.openxmlformats.org/drawingml/2006/main" xmlns:pic="http://schemas.openxmlformats.org/drawingml/2006/picture">
             <wp:extent cx="5943600" cy="2514268"/>
-            <wp:docPr id="6" name="Picture 6"/>
+            <wp:docPr id="5" name="Picture 5"/>
             <wp:cNvGraphicFramePr>
               <a:graphicFrameLocks noChangeAspect="1"/>
             </wp:cNvGraphicFramePr>
@@ -3268,7 +3302,7 @@
                     <pic:cNvPicPr/>
                   </pic:nvPicPr>
                   <pic:blipFill>
-                    <a:blip r:embed="rId15"/>
+                    <a:blip r:embed="rId14"/>
                     <a:stretch>
                       <a:fillRect/>
                     </a:stretch>
@@ -3315,6 +3349,40 @@
     </w:p>
     <w:p>
       <w:pPr>
+        <w:spacing w:line="480" w:lineRule="auto" w:after="0"/>
+        <w:ind w:firstLine="720"/>
+        <w:jc w:val="both"/>
+      </w:pPr>
+      <w:r>
+        <w:rPr>
+          <w:rFonts w:ascii="Georgia" w:hAnsi="Georgia"/>
+          <w:b w:val="0"/>
+          <w:i w:val="0"/>
+          <w:color w:val="000000"/>
+          <w:sz w:val="22"/>
+        </w:rPr>
+        <w:t>Separate age thresholds set on training data to equalize recall, the equal-opportunity standard (Hardt et al., 2016), closed most of the gap (Figure 6), but mainly by reaching fewer younger patients, and overall recall fell by .011, so we would not adopt them by default.</w:t>
+      </w:r>
+    </w:p>
+    <w:p>
+      <w:pPr>
+        <w:spacing w:line="480" w:lineRule="auto" w:after="0"/>
+        <w:ind w:firstLine="720"/>
+        <w:jc w:val="both"/>
+      </w:pPr>
+      <w:r>
+        <w:rPr>
+          <w:rFonts w:ascii="Georgia" w:hAnsi="Georgia"/>
+          <w:b w:val="0"/>
+          <w:i w:val="0"/>
+          <w:color w:val="000000"/>
+          <w:sz w:val="22"/>
+        </w:rPr>
+        <w:t>Other limits remain: prior admissions, the main input, reflects access to care as well as need (Obermeyer et al., 2019); data from 1999–2008 must be recalibrated before use; a deployed model would handle identifiable records, so access must be limited to the care team under HIPAA; and a confident score invites over-reliance (Goddard et al., 2012), which the safeguards below address.</w:t>
+      </w:r>
+    </w:p>
+    <w:p>
+      <w:pPr>
         <w:keepNext/>
         <w:keepLines/>
         <w:spacing w:line="480" w:lineRule="auto" w:after="0" w:before="120"/>
@@ -3327,7 +3395,7 @@
           <w:color w:val="000000"/>
           <w:sz w:val="22"/>
         </w:rPr>
-        <w:t>Figure 7</w:t>
+        <w:t>Figure 6</w:t>
       </w:r>
     </w:p>
     <w:p>
@@ -3357,8 +3425,8 @@
       <w:r>
         <w:drawing>
           <wp:inline xmlns:a="http://schemas.openxmlformats.org/drawingml/2006/main" xmlns:pic="http://schemas.openxmlformats.org/drawingml/2006/picture">
-            <wp:extent cx="5760720" cy="4153509"/>
-            <wp:docPr id="7" name="Picture 7"/>
+            <wp:extent cx="5486400" cy="3860503"/>
+            <wp:docPr id="6" name="Picture 6"/>
             <wp:cNvGraphicFramePr>
               <a:graphicFrameLocks noChangeAspect="1"/>
             </wp:cNvGraphicFramePr>
@@ -3370,7 +3438,7 @@
                     <pic:cNvPicPr/>
                   </pic:nvPicPr>
                   <pic:blipFill>
-                    <a:blip r:embed="rId16"/>
+                    <a:blip r:embed="rId15"/>
                     <a:stretch>
                       <a:fillRect/>
                     </a:stretch>
@@ -3378,7 +3446,7 @@
                   <pic:spPr>
                     <a:xfrm>
                       <a:off x="0" y="0"/>
-                      <a:ext cx="5760720" cy="4153509"/>
+                      <a:ext cx="5486400" cy="3860503"/>
                     </a:xfrm>
                     <a:prstGeom prst="rect"/>
                   </pic:spPr>
@@ -3446,7 +3514,24 @@
           <w:color w:val="000000"/>
           <w:sz w:val="22"/>
         </w:rPr>
-        <w:t>The model supports one recurring decision: which of the day's discharged patients with diabetes the care-transition team contacts first, for a follow-up call, medication reconciliation, and an early clinic visit. Its users are the team's nurses, who would receive each morning the previous day's discharges ranked by calibrated risk, with the two main drivers beside each name; the program manager sets capacity, and with it the threshold. Table 3 and Figure 8 show the result per 1,000 discharges. At the 10% threshold the team contacts 108 patients and reaches 26 of the 113 who will be readmitted, against 12 by random selection, or one readmission for every four contacts. Transitional-care programs cut 30-day readmissions by about 18% (Leppin et al., 2014), and a readmission costs about $15,200 (Weiss &amp; Jiang, 2021), so each contact is worth about $670 in avoided costs, against $308 for random selection; Figure 9 shows these inputs in the code. Two practical lessons follow. Thresholds set on past data miss their target (the 20% threshold flagged 18.1% of new patients), so the team should track its daily flag count; and at 5% capacity the prior-admissions rule does as well as the model, so a very small program could start with the rule.</w:t>
+        <w:t>The model supports one recurring decision: which of the day's discharged patients with diabetes the care-transition team contacts first, for a follow-up call, medication reconciliation, and an early clinic visit. Its users are the team's nurses, who would receive each morning the previous day's discharges ranked by calibrated risk, with the two main drivers beside each name; the program manager sets capacity, and with it the threshold.</w:t>
+      </w:r>
+    </w:p>
+    <w:p>
+      <w:pPr>
+        <w:spacing w:line="480" w:lineRule="auto" w:after="0"/>
+        <w:ind w:firstLine="720"/>
+        <w:jc w:val="both"/>
+      </w:pPr>
+      <w:r>
+        <w:rPr>
+          <w:rFonts w:ascii="Georgia" w:hAnsi="Georgia"/>
+          <w:b w:val="0"/>
+          <w:i w:val="0"/>
+          <w:color w:val="000000"/>
+          <w:sz w:val="22"/>
+        </w:rPr>
+        <w:t>Table 3 and Figure 7 show the result per 1,000 discharges. At the 10% threshold the team contacts 108 patients and reaches 26 of the 113 who will be readmitted, against 12 by random selection, or one readmission for every four contacts.</w:t>
       </w:r>
     </w:p>
     <w:p>
@@ -3523,6 +3608,7 @@
           </w:tcPr>
           <w:p>
             <w:pPr>
+              <w:keepNext/>
               <w:spacing w:line="240" w:lineRule="auto" w:after="0"/>
               <w:jc w:val="left"/>
             </w:pPr>
@@ -3555,6 +3641,7 @@
           </w:tcPr>
           <w:p>
             <w:pPr>
+              <w:keepNext/>
               <w:spacing w:line="240" w:lineRule="auto" w:after="0"/>
               <w:jc w:val="left"/>
             </w:pPr>
@@ -3587,6 +3674,7 @@
           </w:tcPr>
           <w:p>
             <w:pPr>
+              <w:keepNext/>
               <w:spacing w:line="240" w:lineRule="auto" w:after="0"/>
               <w:jc w:val="left"/>
             </w:pPr>
@@ -3619,6 +3707,7 @@
           </w:tcPr>
           <w:p>
             <w:pPr>
+              <w:keepNext/>
               <w:spacing w:line="240" w:lineRule="auto" w:after="0"/>
               <w:jc w:val="left"/>
             </w:pPr>
@@ -3653,6 +3742,7 @@
           </w:tcPr>
           <w:p>
             <w:pPr>
+              <w:keepNext/>
               <w:spacing w:line="240" w:lineRule="auto" w:after="0"/>
               <w:jc w:val="left"/>
             </w:pPr>
@@ -3682,6 +3772,7 @@
           </w:tcPr>
           <w:p>
             <w:pPr>
+              <w:keepNext/>
               <w:spacing w:line="240" w:lineRule="auto" w:after="0"/>
               <w:jc w:val="left"/>
             </w:pPr>
@@ -3711,6 +3802,7 @@
           </w:tcPr>
           <w:p>
             <w:pPr>
+              <w:keepNext/>
               <w:spacing w:line="240" w:lineRule="auto" w:after="0"/>
               <w:jc w:val="left"/>
             </w:pPr>
@@ -3740,6 +3832,7 @@
           </w:tcPr>
           <w:p>
             <w:pPr>
+              <w:keepNext/>
               <w:spacing w:line="240" w:lineRule="auto" w:after="0"/>
               <w:jc w:val="left"/>
             </w:pPr>
@@ -3774,6 +3867,7 @@
           </w:tcPr>
           <w:p>
             <w:pPr>
+              <w:keepNext/>
               <w:spacing w:line="240" w:lineRule="auto" w:after="0"/>
               <w:jc w:val="left"/>
             </w:pPr>
@@ -3803,6 +3897,7 @@
           </w:tcPr>
           <w:p>
             <w:pPr>
+              <w:keepNext/>
               <w:spacing w:line="240" w:lineRule="auto" w:after="0"/>
               <w:jc w:val="left"/>
             </w:pPr>
@@ -3832,6 +3927,7 @@
           </w:tcPr>
           <w:p>
             <w:pPr>
+              <w:keepNext/>
               <w:spacing w:line="240" w:lineRule="auto" w:after="0"/>
               <w:jc w:val="left"/>
             </w:pPr>
@@ -3861,6 +3957,7 @@
           </w:tcPr>
           <w:p>
             <w:pPr>
+              <w:keepNext/>
               <w:spacing w:line="240" w:lineRule="auto" w:after="0"/>
               <w:jc w:val="left"/>
             </w:pPr>
@@ -3895,6 +3992,7 @@
           </w:tcPr>
           <w:p>
             <w:pPr>
+              <w:keepNext/>
               <w:spacing w:line="240" w:lineRule="auto" w:after="0"/>
               <w:jc w:val="left"/>
             </w:pPr>
@@ -3924,6 +4022,7 @@
           </w:tcPr>
           <w:p>
             <w:pPr>
+              <w:keepNext/>
               <w:spacing w:line="240" w:lineRule="auto" w:after="0"/>
               <w:jc w:val="left"/>
             </w:pPr>
@@ -3953,6 +4052,7 @@
           </w:tcPr>
           <w:p>
             <w:pPr>
+              <w:keepNext/>
               <w:spacing w:line="240" w:lineRule="auto" w:after="0"/>
               <w:jc w:val="left"/>
             </w:pPr>
@@ -3982,6 +4082,7 @@
           </w:tcPr>
           <w:p>
             <w:pPr>
+              <w:keepNext/>
               <w:spacing w:line="240" w:lineRule="auto" w:after="0"/>
               <w:jc w:val="left"/>
             </w:pPr>
@@ -4016,6 +4117,7 @@
           </w:tcPr>
           <w:p>
             <w:pPr>
+              <w:keepNext/>
               <w:spacing w:line="240" w:lineRule="auto" w:after="0"/>
               <w:jc w:val="left"/>
             </w:pPr>
@@ -4045,6 +4147,7 @@
           </w:tcPr>
           <w:p>
             <w:pPr>
+              <w:keepNext/>
               <w:spacing w:line="240" w:lineRule="auto" w:after="0"/>
               <w:jc w:val="left"/>
             </w:pPr>
@@ -4074,6 +4177,7 @@
           </w:tcPr>
           <w:p>
             <w:pPr>
+              <w:keepNext/>
               <w:spacing w:line="240" w:lineRule="auto" w:after="0"/>
               <w:jc w:val="left"/>
             </w:pPr>
@@ -4103,6 +4207,7 @@
           </w:tcPr>
           <w:p>
             <w:pPr>
+              <w:keepNext/>
               <w:spacing w:line="240" w:lineRule="auto" w:after="0"/>
               <w:jc w:val="left"/>
             </w:pPr>
@@ -4137,6 +4242,7 @@
           </w:tcPr>
           <w:p>
             <w:pPr>
+              <w:keepNext/>
               <w:spacing w:line="240" w:lineRule="auto" w:after="0"/>
               <w:jc w:val="left"/>
             </w:pPr>
@@ -4166,6 +4272,7 @@
           </w:tcPr>
           <w:p>
             <w:pPr>
+              <w:keepNext/>
               <w:spacing w:line="240" w:lineRule="auto" w:after="0"/>
               <w:jc w:val="left"/>
             </w:pPr>
@@ -4195,6 +4302,7 @@
           </w:tcPr>
           <w:p>
             <w:pPr>
+              <w:keepNext/>
               <w:spacing w:line="240" w:lineRule="auto" w:after="0"/>
               <w:jc w:val="left"/>
             </w:pPr>
@@ -4224,6 +4332,7 @@
           </w:tcPr>
           <w:p>
             <w:pPr>
+              <w:keepNext/>
               <w:spacing w:line="240" w:lineRule="auto" w:after="0"/>
               <w:jc w:val="left"/>
             </w:pPr>
@@ -4258,6 +4367,7 @@
           </w:tcPr>
           <w:p>
             <w:pPr>
+              <w:keepNext/>
               <w:spacing w:line="240" w:lineRule="auto" w:after="0"/>
               <w:jc w:val="left"/>
             </w:pPr>
@@ -4287,6 +4397,7 @@
           </w:tcPr>
           <w:p>
             <w:pPr>
+              <w:keepNext/>
               <w:spacing w:line="240" w:lineRule="auto" w:after="0"/>
               <w:jc w:val="left"/>
             </w:pPr>
@@ -4316,6 +4427,7 @@
           </w:tcPr>
           <w:p>
             <w:pPr>
+              <w:keepNext/>
               <w:spacing w:line="240" w:lineRule="auto" w:after="0"/>
               <w:jc w:val="left"/>
             </w:pPr>
@@ -4345,6 +4457,7 @@
           </w:tcPr>
           <w:p>
             <w:pPr>
+              <w:keepNext/>
               <w:spacing w:line="240" w:lineRule="auto" w:after="0"/>
               <w:jc w:val="left"/>
             </w:pPr>
@@ -4379,6 +4492,7 @@
           </w:tcPr>
           <w:p>
             <w:pPr>
+              <w:keepNext/>
               <w:spacing w:line="240" w:lineRule="auto" w:after="0"/>
               <w:jc w:val="left"/>
             </w:pPr>
@@ -4408,6 +4522,7 @@
           </w:tcPr>
           <w:p>
             <w:pPr>
+              <w:keepNext/>
               <w:spacing w:line="240" w:lineRule="auto" w:after="0"/>
               <w:jc w:val="left"/>
             </w:pPr>
@@ -4437,6 +4552,7 @@
           </w:tcPr>
           <w:p>
             <w:pPr>
+              <w:keepNext/>
               <w:spacing w:line="240" w:lineRule="auto" w:after="0"/>
               <w:jc w:val="left"/>
             </w:pPr>
@@ -4466,6 +4582,7 @@
           </w:tcPr>
           <w:p>
             <w:pPr>
+              <w:keepNext/>
               <w:spacing w:line="240" w:lineRule="auto" w:after="0"/>
               <w:jc w:val="left"/>
             </w:pPr>
@@ -4500,6 +4617,7 @@
           </w:tcPr>
           <w:p>
             <w:pPr>
+              <w:keepNext/>
               <w:spacing w:line="240" w:lineRule="auto" w:after="0"/>
               <w:jc w:val="left"/>
             </w:pPr>
@@ -4529,6 +4647,7 @@
           </w:tcPr>
           <w:p>
             <w:pPr>
+              <w:keepNext/>
               <w:spacing w:line="240" w:lineRule="auto" w:after="0"/>
               <w:jc w:val="left"/>
             </w:pPr>
@@ -4558,6 +4677,7 @@
           </w:tcPr>
           <w:p>
             <w:pPr>
+              <w:keepNext/>
               <w:spacing w:line="240" w:lineRule="auto" w:after="0"/>
               <w:jc w:val="left"/>
             </w:pPr>
@@ -4587,6 +4707,7 @@
           </w:tcPr>
           <w:p>
             <w:pPr>
+              <w:keepNext/>
               <w:spacing w:line="240" w:lineRule="auto" w:after="0"/>
               <w:jc w:val="left"/>
             </w:pPr>
@@ -4645,7 +4766,7 @@
           <w:color w:val="000000"/>
           <w:sz w:val="22"/>
         </w:rPr>
-        <w:t>Figure 8</w:t>
+        <w:t>Figure 7</w:t>
       </w:r>
     </w:p>
     <w:p>
@@ -4676,7 +4797,7 @@
         <w:drawing>
           <wp:inline xmlns:a="http://schemas.openxmlformats.org/drawingml/2006/main" xmlns:pic="http://schemas.openxmlformats.org/drawingml/2006/picture">
             <wp:extent cx="5943600" cy="2025609"/>
-            <wp:docPr id="8" name="Picture 8"/>
+            <wp:docPr id="7" name="Picture 7"/>
             <wp:cNvGraphicFramePr>
               <a:graphicFrameLocks noChangeAspect="1"/>
             </wp:cNvGraphicFramePr>
@@ -4688,7 +4809,7 @@
                     <pic:cNvPicPr/>
                   </pic:nvPicPr>
                   <pic:blipFill>
-                    <a:blip r:embed="rId17"/>
+                    <a:blip r:embed="rId16"/>
                     <a:stretch>
                       <a:fillRect/>
                     </a:stretch>
@@ -4735,6 +4856,23 @@
     </w:p>
     <w:p>
       <w:pPr>
+        <w:spacing w:line="480" w:lineRule="auto" w:after="0"/>
+        <w:ind w:firstLine="720"/>
+        <w:jc w:val="both"/>
+      </w:pPr>
+      <w:r>
+        <w:rPr>
+          <w:rFonts w:ascii="Georgia" w:hAnsi="Georgia"/>
+          <w:b w:val="0"/>
+          <w:i w:val="0"/>
+          <w:color w:val="000000"/>
+          <w:sz w:val="22"/>
+        </w:rPr>
+        <w:t>Transitional-care programs cut 30-day readmissions by about 18% (Leppin et al., 2014), and a readmission costs about $15,200 (Weiss &amp; Jiang, 2021), so each contact is worth about $670 in avoided costs, against $308 for random selection; Figure 8 shows these inputs in the code.</w:t>
+      </w:r>
+    </w:p>
+    <w:p>
+      <w:pPr>
         <w:keepNext/>
         <w:keepLines/>
         <w:spacing w:line="480" w:lineRule="auto" w:after="0" w:before="120"/>
@@ -4747,7 +4885,7 @@
           <w:color w:val="000000"/>
           <w:sz w:val="22"/>
         </w:rPr>
-        <w:t>Figure 9</w:t>
+        <w:t>Figure 8</w:t>
       </w:r>
     </w:p>
     <w:p>
@@ -4777,8 +4915,8 @@
       <w:r>
         <w:drawing>
           <wp:inline xmlns:a="http://schemas.openxmlformats.org/drawingml/2006/main" xmlns:pic="http://schemas.openxmlformats.org/drawingml/2006/picture">
-            <wp:extent cx="5760720" cy="4926435"/>
-            <wp:docPr id="9" name="Picture 9"/>
+            <wp:extent cx="5486400" cy="3131490"/>
+            <wp:docPr id="8" name="Picture 8"/>
             <wp:cNvGraphicFramePr>
               <a:graphicFrameLocks noChangeAspect="1"/>
             </wp:cNvGraphicFramePr>
@@ -4790,7 +4928,7 @@
                     <pic:cNvPicPr/>
                   </pic:nvPicPr>
                   <pic:blipFill>
-                    <a:blip r:embed="rId18"/>
+                    <a:blip r:embed="rId17"/>
                     <a:stretch>
                       <a:fillRect/>
                     </a:stretch>
@@ -4798,7 +4936,7 @@
                   <pic:spPr>
                     <a:xfrm>
                       <a:off x="0" y="0"/>
-                      <a:ext cx="5760720" cy="4926435"/>
+                      <a:ext cx="5486400" cy="3131490"/>
                     </a:xfrm>
                     <a:prstGeom prst="rect"/>
                   </pic:spPr>
@@ -4833,6 +4971,23 @@
           <w:sz w:val="20"/>
         </w:rPr>
         <w:t>Cell [34] of the notebook, Section 19, excerpt (gray bars mark omitted lines). The trial effect and the cost per readmission are set in the first two lines, so a hospital can substitute its own; the printed output gives the values in Table 3.</w:t>
+      </w:r>
+    </w:p>
+    <w:p>
+      <w:pPr>
+        <w:spacing w:line="480" w:lineRule="auto" w:after="0"/>
+        <w:ind w:firstLine="720"/>
+        <w:jc w:val="both"/>
+      </w:pPr>
+      <w:r>
+        <w:rPr>
+          <w:rFonts w:ascii="Georgia" w:hAnsi="Georgia"/>
+          <w:b w:val="0"/>
+          <w:i w:val="0"/>
+          <w:color w:val="000000"/>
+          <w:sz w:val="22"/>
+        </w:rPr>
+        <w:t>Two practical lessons follow. Thresholds set on past data miss their target (the 20% threshold flagged 18.1% of new patients), so the team should track its daily flag count; and at 5% capacity the prior-admissions rule does as well as the model, so a very small program could start with the rule.</w:t>
       </w:r>
     </w:p>
     <w:p>
@@ -4921,13 +5076,9 @@
       </w:r>
     </w:p>
     <w:p>
-      <w:r>
-        <w:br w:type="page"/>
-      </w:r>
-    </w:p>
-    <w:p>
       <w:pPr>
         <w:keepNext/>
+        <w:pageBreakBefore/>
         <w:spacing w:line="480" w:lineRule="auto" w:before="0" w:after="0"/>
         <w:jc w:val="center"/>
       </w:pPr>
@@ -5572,13 +5723,9 @@
       </w:r>
     </w:p>
     <w:p>
-      <w:r>
-        <w:br w:type="page"/>
-      </w:r>
-    </w:p>
-    <w:p>
       <w:pPr>
         <w:keepNext/>
+        <w:pageBreakBefore/>
         <w:spacing w:line="480" w:lineRule="auto" w:before="0" w:after="0"/>
         <w:jc w:val="center"/>
       </w:pPr>
@@ -5640,7 +5787,7 @@
           <w:sz w:val="22"/>
         </w:rPr>
       </w:r>
-      <w:hyperlink r:id="rId19">
+      <w:hyperlink r:id="rId18">
         <w:r>
           <w:rPr>
             <w:rFonts w:ascii="Georgia" w:hAnsi="Georgia"/>
@@ -5667,6 +5814,143 @@
           <w:sz w:val="22"/>
         </w:rPr>
         <w:t>The notebook (Diabetes_Readmission_D2_Chinthaluri_Abburi.ipynb) is self-contained: on first run it downloads the UCI archive, then executes top to bottom and writes every figure and reported number. Part 1 (Sections 1–14) reproduces Deliverable 1 unchanged. Part 2 holds this deliverable: model optimization (Section 15), calibration and thresholds (16), the final evaluation (17), the fairness audit and mitigation test (18), capacity and cost (19), and the saved results (20).</w:t>
+      </w:r>
+    </w:p>
+    <w:p>
+      <w:pPr>
+        <w:keepNext/>
+        <w:pageBreakBefore/>
+        <w:spacing w:line="480" w:lineRule="auto" w:before="0" w:after="0"/>
+        <w:jc w:val="center"/>
+      </w:pPr>
+      <w:r>
+        <w:rPr>
+          <w:rFonts w:ascii="Georgia" w:hAnsi="Georgia"/>
+          <w:b/>
+          <w:i w:val="0"/>
+          <w:color w:val="000000"/>
+          <w:sz w:val="22"/>
+        </w:rPr>
+        <w:t>Appendix B</w:t>
+      </w:r>
+    </w:p>
+    <w:p>
+      <w:pPr>
+        <w:keepNext/>
+        <w:spacing w:line="480" w:lineRule="auto" w:before="0" w:after="0"/>
+        <w:jc w:val="center"/>
+      </w:pPr>
+      <w:r>
+        <w:rPr>
+          <w:rFonts w:ascii="Georgia" w:hAnsi="Georgia"/>
+          <w:b/>
+          <w:i w:val="0"/>
+          <w:color w:val="000000"/>
+          <w:sz w:val="22"/>
+        </w:rPr>
+        <w:t>Supplementary Figure</w:t>
+      </w:r>
+    </w:p>
+    <w:p>
+      <w:pPr>
+        <w:keepNext/>
+        <w:keepLines/>
+        <w:spacing w:line="480" w:lineRule="auto" w:after="0" w:before="120"/>
+      </w:pPr>
+      <w:r>
+        <w:rPr>
+          <w:rFonts w:ascii="Georgia" w:hAnsi="Georgia"/>
+          <w:b/>
+          <w:i w:val="0"/>
+          <w:color w:val="000000"/>
+          <w:sz w:val="22"/>
+        </w:rPr>
+        <w:t>Figure B1</w:t>
+      </w:r>
+    </w:p>
+    <w:p>
+      <w:pPr>
+        <w:keepNext/>
+        <w:keepLines/>
+        <w:spacing w:line="480" w:lineRule="auto" w:after="0"/>
+      </w:pPr>
+      <w:r>
+        <w:rPr>
+          <w:rFonts w:ascii="Georgia" w:hAnsi="Georgia"/>
+          <w:b w:val="0"/>
+          <w:i/>
+          <w:color w:val="000000"/>
+          <w:sz w:val="22"/>
+        </w:rPr>
+        <w:t>Permutation Importance of the Final Model on the Test Set</w:t>
+      </w:r>
+    </w:p>
+    <w:p>
+      <w:pPr>
+        <w:keepNext/>
+        <w:keepLines/>
+        <w:spacing w:line="240" w:lineRule="auto" w:before="80" w:after="40"/>
+        <w:jc w:val="center"/>
+      </w:pPr>
+      <w:r>
+        <w:drawing>
+          <wp:inline xmlns:a="http://schemas.openxmlformats.org/drawingml/2006/main" xmlns:pic="http://schemas.openxmlformats.org/drawingml/2006/picture">
+            <wp:extent cx="4937760" cy="3110758"/>
+            <wp:docPr id="9" name="Picture 9"/>
+            <wp:cNvGraphicFramePr>
+              <a:graphicFrameLocks noChangeAspect="1"/>
+            </wp:cNvGraphicFramePr>
+            <a:graphic>
+              <a:graphicData uri="http://schemas.openxmlformats.org/drawingml/2006/picture">
+                <pic:pic>
+                  <pic:nvPicPr>
+                    <pic:cNvPr id="0" name="d2_importance.png"/>
+                    <pic:cNvPicPr/>
+                  </pic:nvPicPr>
+                  <pic:blipFill>
+                    <a:blip r:embed="rId19"/>
+                    <a:stretch>
+                      <a:fillRect/>
+                    </a:stretch>
+                  </pic:blipFill>
+                  <pic:spPr>
+                    <a:xfrm>
+                      <a:off x="0" y="0"/>
+                      <a:ext cx="4937760" cy="3110758"/>
+                    </a:xfrm>
+                    <a:prstGeom prst="rect"/>
+                  </pic:spPr>
+                </pic:pic>
+              </a:graphicData>
+            </a:graphic>
+          </wp:inline>
+        </w:drawing>
+      </w:r>
+    </w:p>
+    <w:p>
+      <w:pPr>
+        <w:keepLines/>
+        <w:spacing w:line="480" w:lineRule="auto" w:after="0"/>
+      </w:pPr>
+      <w:r>
+        <w:rPr>
+          <w:rFonts w:ascii="Georgia" w:hAnsi="Georgia"/>
+          <w:b w:val="0"/>
+          <w:i/>
+          <w:color w:val="000000"/>
+          <w:sz w:val="20"/>
+        </w:rPr>
+        <w:t xml:space="preserve">Note. </w:t>
+      </w:r>
+      <w:r>
+        <w:rPr>
+          <w:rFonts w:ascii="Georgia" w:hAnsi="Georgia"/>
+          <w:b w:val="0"/>
+          <w:i w:val="0"/>
+          <w:color w:val="000000"/>
+          <w:sz w:val="20"/>
+        </w:rPr>
+        <w:t>Drop in test ROC-AUC when one input column is shuffled (mean of five repeats; bars show one standard deviation). Each bar covers all dummy columns of a categorical input.</w:t>
       </w:r>
     </w:p>
     <w:sectPr>

</xml_diff>

<commit_message>
Final report pass: no Appendix B, transparency, repository link
- The permutation-importance chart is no longer a separate appendix; the
  text reports its two key numbers and points to notebook Section 17
- Ethical Considerations: the forest is less transparent than the logistic
  regression it replaced, so each flag should show the inputs behind it
- Appendix A adds the GitHub repository link (code history, pull-request
  reviews, decision log) next to the Colab link; the team paragraph
  points to it

17 pages; every number, citation, and page-length check unchanged.
</commit_message>
<xml_diff>
--- a/Diabetes_Readmission_Deliverable2_Chinthaluri_Abburi.docx
+++ b/Diabetes_Readmission_Deliverable2_Chinthaluri_Abburi.docx
@@ -3106,7 +3106,7 @@
           <w:color w:val="000000"/>
           <w:sz w:val="22"/>
         </w:rPr>
-        <w:t>Permutation importance (Figure B1 in Appendix B) shows that prior inpatient admissions and discharge destination carry the model (AUC drops of .070 and .053; no other input exceeds .005), so the forest gains by combining known signals more flexibly, not by finding new ones. The result is a well-calibrated, modestly sharper model, not a breakthrough: at 10% capacity it still misses about three readmissions in four.</w:t>
+        <w:t>Permutation importance in the notebook (Section 17) shows that prior inpatient admissions and discharge destination carry the model (AUC drops of .070 and .053; no other input exceeds .005), so the forest gains by combining known signals more flexibly, not by finding new ones. The result is a well-calibrated, modestly sharper model, not a breakthrough: at 10% capacity it still misses about three readmissions in four.</w:t>
       </w:r>
     </w:p>
     <w:p>
@@ -3378,7 +3378,7 @@
           <w:color w:val="000000"/>
           <w:sz w:val="22"/>
         </w:rPr>
-        <w:t>Other limits remain: prior admissions, the main input, reflects access to care as well as need (Obermeyer et al., 2019); data from 1999–2008 must be recalibrated before use; a deployed model would handle identifiable records, so access must be limited to the care team under HIPAA; and a confident score invites over-reliance (Goddard et al., 2012), which the safeguards below address.</w:t>
+        <w:t>Other limits remain. The forest is less transparent than the logistic regression it replaced, so each flag should show the inputs behind it; prior admissions, the main input, reflects access to care as well as need (Obermeyer et al., 2019); data from 1999–2008 must be recalibrated before use; identifiable records must stay with the care team under HIPAA; and a confident score invites over-reliance (Goddard et al., 2012), which the safeguards below address.</w:t>
       </w:r>
     </w:p>
     <w:p>
@@ -5072,7 +5072,7 @@
           <w:color w:val="000000"/>
           <w:sz w:val="22"/>
         </w:rPr>
-        <w:t>We again shared the work equally, with the roles rotated from Deliverable 1. Abburi led the model optimization, calibration, thresholds, and final evaluation (notebook Sections 15–17), and Chinthaluri led the fairness audit, the mitigation test, and the capacity and cost analysis (Sections 18–19). Each of us reviewed and approved the other's pull request in our shared GitHub repository before it was merged, and each methodological decision, including the model-selection rule, the calibration method, and the mitigation target, was logged with its proposer and reviewer. Because this report is generated from the notebook's results file (Sandve et al., 2013), every number in it matches the code in Appendix A.</w:t>
+        <w:t>We again shared the work equally, with the roles rotated from Deliverable 1. Abburi led the model optimization, calibration, thresholds, and final evaluation (notebook Sections 15–17), and Chinthaluri led the fairness audit, the mitigation test, and the capacity and cost analysis (Sections 18–19). Each of us reviewed and approved the other's pull request in our shared GitHub repository (Appendix A) before it was merged, and each methodological decision, including the model-selection rule, the calibration method, and the mitigation target, was logged with its proposer and reviewer. Because this report is generated from the notebook's results file (Sandve et al., 2013), every number in it matches the code in Appendix A.</w:t>
       </w:r>
     </w:p>
     <w:p>
@@ -5802,6 +5802,48 @@
     <w:p>
       <w:pPr>
         <w:spacing w:line="480" w:lineRule="auto" w:after="0"/>
+        <w:jc w:val="left"/>
+      </w:pPr>
+      <w:r>
+        <w:rPr>
+          <w:rFonts w:ascii="Georgia" w:hAnsi="Georgia"/>
+          <w:b w:val="0"/>
+          <w:i w:val="0"/>
+          <w:color w:val="000000"/>
+          <w:sz w:val="22"/>
+        </w:rPr>
+        <w:t>Project repository (code history, pull-request reviews, and decision log):</w:t>
+      </w:r>
+    </w:p>
+    <w:p>
+      <w:pPr>
+        <w:spacing w:line="480" w:lineRule="auto" w:after="0"/>
+        <w:jc w:val="left"/>
+      </w:pPr>
+      <w:r>
+        <w:rPr>
+          <w:rFonts w:ascii="Georgia" w:hAnsi="Georgia"/>
+          <w:b w:val="0"/>
+          <w:i w:val="0"/>
+          <w:color w:val="000000"/>
+          <w:sz w:val="22"/>
+        </w:rPr>
+      </w:r>
+      <w:hyperlink r:id="rId19">
+        <w:r>
+          <w:rPr>
+            <w:rFonts w:ascii="Georgia" w:hAnsi="Georgia"/>
+            <w:color w:val="0563C1"/>
+            <w:u w:val="single"/>
+            <w:sz w:val="22"/>
+          </w:rPr>
+          <w:t xml:space="preserve">https://github.com/ychinthaluri53651/diabetes-readmission-residency-day-1</w:t>
+        </w:r>
+      </w:hyperlink>
+    </w:p>
+    <w:p>
+      <w:pPr>
+        <w:spacing w:line="480" w:lineRule="auto" w:after="0"/>
         <w:ind w:firstLine="720"/>
         <w:jc w:val="both"/>
       </w:pPr>
@@ -5814,143 +5856,6 @@
           <w:sz w:val="22"/>
         </w:rPr>
         <w:t>The notebook (Diabetes_Readmission_D2_Chinthaluri_Abburi.ipynb) is self-contained: on first run it downloads the UCI archive, then executes top to bottom and writes every figure and reported number. Part 1 (Sections 1–14) reproduces Deliverable 1 unchanged. Part 2 holds this deliverable: model optimization (Section 15), calibration and thresholds (16), the final evaluation (17), the fairness audit and mitigation test (18), capacity and cost (19), and the saved results (20).</w:t>
-      </w:r>
-    </w:p>
-    <w:p>
-      <w:pPr>
-        <w:keepNext/>
-        <w:pageBreakBefore/>
-        <w:spacing w:line="480" w:lineRule="auto" w:before="0" w:after="0"/>
-        <w:jc w:val="center"/>
-      </w:pPr>
-      <w:r>
-        <w:rPr>
-          <w:rFonts w:ascii="Georgia" w:hAnsi="Georgia"/>
-          <w:b/>
-          <w:i w:val="0"/>
-          <w:color w:val="000000"/>
-          <w:sz w:val="22"/>
-        </w:rPr>
-        <w:t>Appendix B</w:t>
-      </w:r>
-    </w:p>
-    <w:p>
-      <w:pPr>
-        <w:keepNext/>
-        <w:spacing w:line="480" w:lineRule="auto" w:before="0" w:after="0"/>
-        <w:jc w:val="center"/>
-      </w:pPr>
-      <w:r>
-        <w:rPr>
-          <w:rFonts w:ascii="Georgia" w:hAnsi="Georgia"/>
-          <w:b/>
-          <w:i w:val="0"/>
-          <w:color w:val="000000"/>
-          <w:sz w:val="22"/>
-        </w:rPr>
-        <w:t>Supplementary Figure</w:t>
-      </w:r>
-    </w:p>
-    <w:p>
-      <w:pPr>
-        <w:keepNext/>
-        <w:keepLines/>
-        <w:spacing w:line="480" w:lineRule="auto" w:after="0" w:before="120"/>
-      </w:pPr>
-      <w:r>
-        <w:rPr>
-          <w:rFonts w:ascii="Georgia" w:hAnsi="Georgia"/>
-          <w:b/>
-          <w:i w:val="0"/>
-          <w:color w:val="000000"/>
-          <w:sz w:val="22"/>
-        </w:rPr>
-        <w:t>Figure B1</w:t>
-      </w:r>
-    </w:p>
-    <w:p>
-      <w:pPr>
-        <w:keepNext/>
-        <w:keepLines/>
-        <w:spacing w:line="480" w:lineRule="auto" w:after="0"/>
-      </w:pPr>
-      <w:r>
-        <w:rPr>
-          <w:rFonts w:ascii="Georgia" w:hAnsi="Georgia"/>
-          <w:b w:val="0"/>
-          <w:i/>
-          <w:color w:val="000000"/>
-          <w:sz w:val="22"/>
-        </w:rPr>
-        <w:t>Permutation Importance of the Final Model on the Test Set</w:t>
-      </w:r>
-    </w:p>
-    <w:p>
-      <w:pPr>
-        <w:keepNext/>
-        <w:keepLines/>
-        <w:spacing w:line="240" w:lineRule="auto" w:before="80" w:after="40"/>
-        <w:jc w:val="center"/>
-      </w:pPr>
-      <w:r>
-        <w:drawing>
-          <wp:inline xmlns:a="http://schemas.openxmlformats.org/drawingml/2006/main" xmlns:pic="http://schemas.openxmlformats.org/drawingml/2006/picture">
-            <wp:extent cx="4937760" cy="3110758"/>
-            <wp:docPr id="9" name="Picture 9"/>
-            <wp:cNvGraphicFramePr>
-              <a:graphicFrameLocks noChangeAspect="1"/>
-            </wp:cNvGraphicFramePr>
-            <a:graphic>
-              <a:graphicData uri="http://schemas.openxmlformats.org/drawingml/2006/picture">
-                <pic:pic>
-                  <pic:nvPicPr>
-                    <pic:cNvPr id="0" name="d2_importance.png"/>
-                    <pic:cNvPicPr/>
-                  </pic:nvPicPr>
-                  <pic:blipFill>
-                    <a:blip r:embed="rId19"/>
-                    <a:stretch>
-                      <a:fillRect/>
-                    </a:stretch>
-                  </pic:blipFill>
-                  <pic:spPr>
-                    <a:xfrm>
-                      <a:off x="0" y="0"/>
-                      <a:ext cx="4937760" cy="3110758"/>
-                    </a:xfrm>
-                    <a:prstGeom prst="rect"/>
-                  </pic:spPr>
-                </pic:pic>
-              </a:graphicData>
-            </a:graphic>
-          </wp:inline>
-        </w:drawing>
-      </w:r>
-    </w:p>
-    <w:p>
-      <w:pPr>
-        <w:keepLines/>
-        <w:spacing w:line="480" w:lineRule="auto" w:after="0"/>
-      </w:pPr>
-      <w:r>
-        <w:rPr>
-          <w:rFonts w:ascii="Georgia" w:hAnsi="Georgia"/>
-          <w:b w:val="0"/>
-          <w:i/>
-          <w:color w:val="000000"/>
-          <w:sz w:val="20"/>
-        </w:rPr>
-        <w:t xml:space="preserve">Note. </w:t>
-      </w:r>
-      <w:r>
-        <w:rPr>
-          <w:rFonts w:ascii="Georgia" w:hAnsi="Georgia"/>
-          <w:b w:val="0"/>
-          <w:i w:val="0"/>
-          <w:color w:val="000000"/>
-          <w:sz w:val="20"/>
-        </w:rPr>
-        <w:t>Drop in test ROC-AUC when one input column is shuffled (mean of five repeats; bars show one standard deviation). Each bar covers all dummy columns of a categorical input.</w:t>
       </w:r>
     </w:p>
     <w:sectPr>

</xml_diff>